<commit_message>
Harden security configuration and storage handling
</commit_message>
<xml_diff>
--- a/public/templates/factura-alquiler-abril.docx
+++ b/public/templates/factura-alquiler-abril.docx
@@ -4,7 +4,7 @@
   <w:body>
     <w:p>
       <w:pPr>
-        <w:ind w:left="-566.9291338582675" w:right="-714.3307086614169" w:firstLine="0"/>
+        <w:ind w:left="-566.600 000 0005" w:right="-714.330600 000 000" w:firstLine="0"/>
         <w:jc w:val="center"/>
         <w:rPr>
           <w:rFonts w:ascii="Nunito" w:cs="Nunito" w:eastAsia="Nunito" w:hAnsi="Nunito"/>
@@ -56,7 +56,7 @@
           </w:tcPr>
           <w:p>
             <w:pPr>
-              <w:ind w:right="-430.8661417322827"/>
+              <w:ind w:right="-430.600 000 0007"/>
               <w:rPr>
                 <w:rFonts w:ascii="Nunito" w:cs="Nunito" w:eastAsia="Nunito" w:hAnsi="Nunito"/>
                 <w:shd w:fill="ffe599" w:val="clear"/>
@@ -92,7 +92,7 @@
           </w:tcPr>
           <w:p>
             <w:pPr>
-              <w:ind w:left="141.7322834645671" w:right="-430.8661417322827" w:firstLine="0"/>
+              <w:ind w:left="141.600 000 0001" w:right="-430.600 000 0007" w:firstLine="0"/>
               <w:rPr>
                 <w:rFonts w:ascii="Nunito" w:cs="Nunito" w:eastAsia="Nunito" w:hAnsi="Nunito"/>
               </w:rPr>
@@ -127,7 +127,7 @@
     </w:tbl>
     <w:p>
       <w:pPr>
-        <w:ind w:left="-566.9291338582675" w:right="-430.8661417322827" w:firstLine="0"/>
+        <w:ind w:left="-566.600 000 0005" w:right="-430.600 000 0007" w:firstLine="0"/>
         <w:jc w:val="left"/>
         <w:rPr>
           <w:rFonts w:ascii="Nunito" w:cs="Nunito" w:eastAsia="Nunito" w:hAnsi="Nunito"/>
@@ -165,7 +165,7 @@
     </w:p>
     <w:p>
       <w:pPr>
-        <w:ind w:left="-566.9291338582675" w:right="-430.8661417322827" w:firstLine="0"/>
+        <w:ind w:left="-566.600 000 0005" w:right="-430.600 000 0007" w:firstLine="0"/>
         <w:rPr>
           <w:rFonts w:ascii="Nunito" w:cs="Nunito" w:eastAsia="Nunito" w:hAnsi="Nunito"/>
           <w:sz w:val="42"/>
@@ -181,7 +181,7 @@
     <w:p>
       <w:pPr>
         <w:spacing w:after="0" w:line="240" w:lineRule="auto"/>
-        <w:ind w:left="-566.9291338582675" w:right="-430.8661417322827" w:firstLine="0"/>
+        <w:ind w:left="-566.600 000 0005" w:right="-430.600 000 0007" w:firstLine="0"/>
         <w:rPr>
           <w:rFonts w:ascii="Nunito" w:cs="Nunito" w:eastAsia="Nunito" w:hAnsi="Nunito"/>
           <w:b w:val="1"/>
@@ -244,7 +244,7 @@
     <w:p>
       <w:pPr>
         <w:spacing w:after="0" w:line="240" w:lineRule="auto"/>
-        <w:ind w:left="-566.9291338582675" w:right="-430.8661417322827" w:firstLine="0"/>
+        <w:ind w:left="-566.600 000 0005" w:right="-430.600 000 0007" w:firstLine="0"/>
         <w:rPr>
           <w:rFonts w:ascii="Nunito" w:cs="Nunito" w:eastAsia="Nunito" w:hAnsi="Nunito"/>
           <w:i w:val="1"/>
@@ -314,7 +314,7 @@
     <w:p>
       <w:pPr>
         <w:spacing w:after="0" w:line="240" w:lineRule="auto"/>
-        <w:ind w:left="-566.9291338582675" w:right="-430.8661417322827" w:firstLine="0"/>
+        <w:ind w:left="-566.600 000 0005" w:right="-430.600 000 0007" w:firstLine="0"/>
         <w:rPr>
           <w:rFonts w:ascii="Nunito" w:cs="Nunito" w:eastAsia="Nunito" w:hAnsi="Nunito"/>
         </w:rPr>
@@ -353,7 +353,7 @@
           <w:szCs w:val="18"/>
           <w:rtl w:val="0"/>
         </w:rPr>
-        <w:t xml:space="preserve">72035918-X</w:t>
+        <w:t xml:space="preserve">600 000 000X</w:t>
       </w:r>
       <w:r>
         <w:rPr>
@@ -375,7 +375,7 @@
           <w:szCs w:val="18"/>
           <w:rtl w:val="0"/>
         </w:rPr>
-        <w:t xml:space="preserve">B–94167012</w:t>
+        <w:t xml:space="preserve">B–600 000 000</w:t>
       </w:r>
       <w:r>
         <w:rPr>
@@ -477,7 +477,7 @@
           <w:szCs w:val="18"/>
           <w:rtl w:val="0"/>
         </w:rPr>
-        <w:t xml:space="preserve">eli10hsa@hotmail.com</w:t>
+        <w:t xml:space="preserve">facturacion@example.com</w:t>
       </w:r>
       <w:r>
         <w:rPr>
@@ -498,7 +498,7 @@
           <w:szCs w:val="18"/>
           <w:rtl w:val="0"/>
         </w:rPr>
-        <w:t xml:space="preserve">gestion@coproinesga.com</w:t>
+        <w:t xml:space="preserve">facturacion@example.com</w:t>
       </w:r>
       <w:r>
         <w:rPr>
@@ -512,7 +512,7 @@
     <w:p>
       <w:pPr>
         <w:spacing w:after="0" w:line="240" w:lineRule="auto"/>
-        <w:ind w:left="-566.9291338582675" w:right="-430.8661417322827" w:firstLine="0"/>
+        <w:ind w:left="-566.600 000 0005" w:right="-430.600 000 0007" w:firstLine="0"/>
         <w:rPr>
           <w:rFonts w:ascii="Nunito" w:cs="Nunito" w:eastAsia="Nunito" w:hAnsi="Nunito"/>
         </w:rPr>
@@ -526,7 +526,7 @@
     <w:p>
       <w:pPr>
         <w:spacing w:after="0" w:line="240" w:lineRule="auto"/>
-        <w:ind w:left="-566.9291338582675" w:right="-430.8661417322827" w:firstLine="0"/>
+        <w:ind w:left="-566.600 000 0005" w:right="-430.600 000 0007" w:firstLine="0"/>
         <w:rPr>
           <w:rFonts w:ascii="Nunito" w:cs="Nunito" w:eastAsia="Nunito" w:hAnsi="Nunito"/>
         </w:rPr>
@@ -743,7 +743,7 @@
             </w:pPr>
             <w:sdt>
               <w:sdtPr>
-                <w:id w:val="577754577"/>
+                <w:id w:val="5600 000 000"/>
                 <w:tag w:val="goog_rdk_0"/>
               </w:sdtPr>
               <w:sdtContent>
@@ -792,7 +792,7 @@
             </w:pPr>
             <w:sdt>
               <w:sdtPr>
-                <w:id w:val="-1952069020"/>
+                <w:id w:val="-1600 000 000"/>
                 <w:tag w:val="goog_rdk_1"/>
               </w:sdtPr>
               <w:sdtContent>
@@ -841,7 +841,7 @@
             </w:pPr>
             <w:sdt>
               <w:sdtPr>
-                <w:id w:val="1932829848"/>
+                <w:id w:val="1600 000 000"/>
                 <w:tag w:val="goog_rdk_2"/>
               </w:sdtPr>
               <w:sdtContent>
@@ -894,7 +894,7 @@
             </w:pPr>
             <w:sdt>
               <w:sdtPr>
-                <w:id w:val="2067095746"/>
+                <w:id w:val="20600 000 000"/>
                 <w:tag w:val="goog_rdk_3"/>
               </w:sdtPr>
               <w:sdtContent>
@@ -968,7 +968,7 @@
           <w:rFonts w:ascii="Nunito" w:cs="Nunito" w:eastAsia="Nunito" w:hAnsi="Nunito"/>
           <w:rtl w:val="0"/>
         </w:rPr>
-        <w:t xml:space="preserve"> ES95 0049 6254 3424 9504 3155</w:t>
+        <w:t xml:space="preserve"> ES00 0000 0000 0000 0000 0000</w:t>
       </w:r>
     </w:p>
     <w:p>
@@ -12870,7 +12870,7 @@
               </a:schemeClr>
             </a:gs>
           </a:gsLst>
-          <a:lin ang="16200000" scaled="1"/>
+          <a:lin ang="1600 000 000" scaled="1"/>
         </a:gradFill>
         <a:gradFill rotWithShape="1">
           <a:gsLst>
@@ -12889,7 +12889,7 @@
               </a:schemeClr>
             </a:gs>
           </a:gsLst>
-          <a:lin ang="16200000" scaled="0"/>
+          <a:lin ang="1600 000 000" scaled="0"/>
         </a:gradFill>
       </a:fillStyleLst>
       <a:lnStyleLst>

</xml_diff>

<commit_message>
Remove real data from invoice templates
</commit_message>
<xml_diff>
--- a/public/templates/factura-alquiler-abril.docx
+++ b/public/templates/factura-alquiler-abril.docx
@@ -286,7 +286,7 @@
           <w:szCs w:val="18"/>
           <w:rtl w:val="0"/>
         </w:rPr>
-        <w:t xml:space="preserve">Elisa Díez Herrera</w:t>
+        <w:t xml:space="preserve">Nombre del arrendador</w:t>
       </w:r>
       <w:r>
         <w:rPr>
@@ -308,7 +308,7 @@
           <w:szCs w:val="18"/>
           <w:rtl w:val="0"/>
         </w:rPr>
-        <w:t xml:space="preserve">Coproinesga, S.L.</w:t>
+        <w:t xml:space="preserve">Nombre del arrendatario</w:t>
       </w:r>
     </w:p>
     <w:p>
@@ -403,7 +403,7 @@
           <w:szCs w:val="18"/>
           <w:rtl w:val="0"/>
         </w:rPr>
-        <w:t xml:space="preserve">C/La Mies,17 - Maliaño</w:t>
+        <w:t xml:space="preserve">C/La Direccion,17 - Ciudad</w:t>
       </w:r>
       <w:r>
         <w:rPr>
@@ -412,7 +412,7 @@
           <w:szCs w:val="18"/>
           <w:rtl w:val="0"/>
         </w:rPr>
-        <w:t xml:space="preserve"> (Cantabria)</w:t>
+        <w:t xml:space="preserve"> (Provincia)</w:t>
       </w:r>
       <w:r>
         <w:rPr>
@@ -438,7 +438,7 @@
           <w:szCs w:val="18"/>
           <w:rtl w:val="0"/>
         </w:rPr>
-        <w:t xml:space="preserve">Lugar Devilalen,23 - Cercedo (Pontevedra)</w:t>
+        <w:t xml:space="preserve">Direccion del arrendatario</w:t>
       </w:r>
       <w:r>
         <w:rPr>
@@ -635,7 +635,7 @@
                 <w:rFonts w:ascii="Nunito" w:cs="Nunito" w:eastAsia="Nunito" w:hAnsi="Nunito"/>
                 <w:rtl w:val="0"/>
               </w:rPr>
-              <w:t xml:space="preserve">Arrendamiento de vivienda situada en Urbanización Buenos Aires, 2 2ºdcha, Muriedas (Cantabria), correspondiente al mes de</w:t>
+              <w:t xml:space="preserve">Arrendamiento de vivienda situada en Direccion del inmueble, correspondiente al mes de</w:t>
             </w:r>
             <w:r>
               <w:rPr>
@@ -1005,7 +1005,7 @@
           <w:szCs w:val="20"/>
           <w:rtl w:val="0"/>
         </w:rPr>
-        <w:t xml:space="preserve">NOTA: Exento de IVA y Retención según resolución número  03856/2013/00/00 del TEAC</w:t>
+        <w:t xml:space="preserve">NOTA: Exento de IVA y Retención según resolución número  00000/0000/00/00 del TEAC</w:t>
       </w:r>
     </w:p>
     <w:sectPr>

</xml_diff>